<commit_message>
Convierte los pies de figura en resumenes cortos
Los pies decian solo que se veia en la foto. Ahora cada uno resume ademas
que se hizo en ese paso —por que la base va en otra maquina, por que el
orden de los dos SQL importa, por que fallaron los dos primeros
despliegues— para que la captura se entienda sin volver al texto.

Van en negrita, que era el estilo pedido.
</commit_message>
<xml_diff>
--- a/docs/Informe-con-pies-de-figura.docx
+++ b/docs/Informe-con-pies-de-figura.docx
@@ -2262,16 +2262,17 @@
     </w:p>
     <w:p>
       <w:pPr>
-        <w:jc w:val="center"/>
+        <w:jc w:val="both"/>
         <w:spacing w:after="240" w:line="240" w:lineRule="auto"/>
       </w:pPr>
       <w:r>
         <w:rPr>
-          <w:i/>
+          <w:b/>
+          <w:bCs/>
           <w:sz w:val="20"/>
           <w:szCs w:val="20"/>
         </w:rPr>
-        <w:t xml:space="preserve">Figura 2. Cuenta de alojamiento creada, con el subdominio asignado.</w:t>
+        <w:t xml:space="preserve">Figura 2. Cuenta creada en InfinityFree con el subdominio asignado. El panel entrega el identificador que después aparece como prefijo en la base y el usuario.</w:t>
       </w:r>
     </w:p>
     <w:p>
@@ -2400,16 +2401,17 @@
     </w:p>
     <w:p>
       <w:pPr>
-        <w:jc w:val="center"/>
+        <w:jc w:val="both"/>
         <w:spacing w:after="240" w:line="240" w:lineRule="auto"/>
       </w:pPr>
       <w:r>
         <w:rPr>
-          <w:i/>
+          <w:b/>
+          <w:bCs/>
           <w:sz w:val="20"/>
           <w:szCs w:val="20"/>
         </w:rPr>
-        <w:t xml:space="preserve">Figura 3. Archivos del proyecto cargados en la carpeta htdocs.</w:t>
+        <w:t xml:space="preserve">Figura 3. Proyecto ya cargado dentro de htdocs, la carpeta pública del servidor. Se subió comprimido en ZIP y se extrajo ahí mismo.</w:t>
       </w:r>
     </w:p>
     <w:p>
@@ -2526,16 +2528,17 @@
     </w:p>
     <w:p>
       <w:pPr>
-        <w:jc w:val="center"/>
+        <w:jc w:val="both"/>
         <w:spacing w:after="240" w:line="240" w:lineRule="auto"/>
       </w:pPr>
       <w:r>
         <w:rPr>
-          <w:i/>
+          <w:b/>
+          <w:bCs/>
           <w:sz w:val="20"/>
           <w:szCs w:val="20"/>
         </w:rPr>
-        <w:t xml:space="preserve">Figura 4. Base de datos creada y datos de conexión que entrega el panel.</w:t>
+        <w:t xml:space="preserve">Figura 4. Base de datos creada desde el panel. Muestra los cuatro datos de conexión, incluido el servidor MySQL, que es una máquina distinta del sitio.</w:t>
       </w:r>
     </w:p>
     <w:p>
@@ -2628,16 +2631,17 @@
     </w:p>
     <w:p>
       <w:pPr>
-        <w:jc w:val="center"/>
+        <w:jc w:val="both"/>
         <w:spacing w:after="240" w:line="240" w:lineRule="auto"/>
       </w:pPr>
       <w:r>
         <w:rPr>
-          <w:i/>
+          <w:b/>
+          <w:bCs/>
           <w:sz w:val="20"/>
           <w:szCs w:val="20"/>
         </w:rPr>
-        <w:t xml:space="preserve">Figura 5. Importación de la base desde phpMyAdmin.</w:t>
+        <w:t xml:space="preserve">Figura 5. Importación en phpMyAdmin. Primero el archivo de estructura y después el de contenido, porque el segundo inserta en tablas que crea el primero.</w:t>
       </w:r>
     </w:p>
     <w:p>
@@ -2804,16 +2808,17 @@
     </w:p>
     <w:p>
       <w:pPr>
-        <w:jc w:val="center"/>
+        <w:jc w:val="both"/>
         <w:spacing w:after="240" w:line="240" w:lineRule="auto"/>
       </w:pPr>
       <w:r>
         <w:rPr>
-          <w:i/>
+          <w:b/>
+          <w:bCs/>
           <w:sz w:val="20"/>
           <w:szCs w:val="20"/>
         </w:rPr>
-        <w:t xml:space="preserve">Figura 6. Archivo de configuración creado en el servidor.</w:t>
+        <w:t xml:space="preserve">Figura 6. Archivo de configuración creado en el servidor con los datos del panel. Queda fuera del repositorio para no exponer la contraseña.</w:t>
       </w:r>
     </w:p>
     <w:p>
@@ -2923,16 +2928,17 @@
     </w:p>
     <w:p>
       <w:pPr>
-        <w:jc w:val="center"/>
+        <w:jc w:val="both"/>
         <w:spacing w:after="240" w:line="240" w:lineRule="auto"/>
       </w:pPr>
       <w:r>
         <w:rPr>
-          <w:i/>
+          <w:b/>
+          <w:bCs/>
           <w:sz w:val="20"/>
           <w:szCs w:val="20"/>
         </w:rPr>
-        <w:t xml:space="preserve">Figura 7. Sitio publicado y funcionando en su dirección pública.</w:t>
+        <w:t xml:space="preserve">Figura 7. Sitio ya publicado en su dirección pública, cargando los reportajes desde la base de datos del hosting.</w:t>
       </w:r>
     </w:p>
     <w:p>
@@ -3021,16 +3027,17 @@
     </w:p>
     <w:p>
       <w:pPr>
-        <w:jc w:val="center"/>
+        <w:jc w:val="both"/>
         <w:spacing w:after="240" w:line="240" w:lineRule="auto"/>
       </w:pPr>
       <w:r>
         <w:rPr>
-          <w:i/>
+          <w:b/>
+          <w:bCs/>
           <w:sz w:val="20"/>
           <w:szCs w:val="20"/>
         </w:rPr>
-        <w:t xml:space="preserve">Figura 8. Migración de la estructura aplicada desde phpMyAdmin.</w:t>
+        <w:t xml:space="preserve">Figura 8. Migración aplicada desde phpMyAdmin. Los cambios de estructura no viajan por Git, así que se ejecutan una vez en el servidor.</w:t>
       </w:r>
     </w:p>
     <w:p>
@@ -3124,16 +3131,17 @@
     </w:p>
     <w:p>
       <w:pPr>
-        <w:jc w:val="center"/>
+        <w:jc w:val="both"/>
         <w:spacing w:after="240" w:line="240" w:lineRule="auto"/>
       </w:pPr>
       <w:r>
         <w:rPr>
-          <w:i/>
+          <w:b/>
+          <w:bCs/>
           <w:sz w:val="20"/>
           <w:szCs w:val="20"/>
         </w:rPr>
-        <w:t xml:space="preserve">Figura 9. Repositorio antes de cargar los secretos.</w:t>
+        <w:t xml:space="preserve">Figura 9. Repositorio antes de configurar el despliegue: todavía sin secretos cargados.</w:t>
       </w:r>
     </w:p>
     <w:p>
@@ -3191,16 +3199,17 @@
     </w:p>
     <w:p>
       <w:pPr>
-        <w:jc w:val="center"/>
+        <w:jc w:val="both"/>
         <w:spacing w:after="240" w:line="240" w:lineRule="auto"/>
       </w:pPr>
       <w:r>
         <w:rPr>
-          <w:i/>
+          <w:b/>
+          <w:bCs/>
           <w:sz w:val="20"/>
           <w:szCs w:val="20"/>
         </w:rPr>
-        <w:t xml:space="preserve">Figura 10. Alta del secreto con el servidor de FTP.</w:t>
+        <w:t xml:space="preserve">Figura 10. Alta del primer secreto con la dirección del servidor FTP. GitHub los guarda cifrados y no los muestra en los registros.</w:t>
       </w:r>
     </w:p>
     <w:p>
@@ -3258,16 +3267,17 @@
     </w:p>
     <w:p>
       <w:pPr>
-        <w:jc w:val="center"/>
+        <w:jc w:val="both"/>
         <w:spacing w:after="240" w:line="240" w:lineRule="auto"/>
       </w:pPr>
       <w:r>
         <w:rPr>
-          <w:i/>
+          <w:b/>
+          <w:bCs/>
           <w:sz w:val="20"/>
           <w:szCs w:val="20"/>
         </w:rPr>
-        <w:t xml:space="preserve">Figura 11. Alta del secreto con la contraseña de FTP.</w:t>
+        <w:t xml:space="preserve">Figura 11. Alta del secreto con la contraseña de FTP, difuminada en la captura. Con los tres secretos, el despliegue queda habilitado.</w:t>
       </w:r>
     </w:p>
     <w:p>
@@ -3340,16 +3350,17 @@
     </w:p>
     <w:p>
       <w:pPr>
-        <w:jc w:val="center"/>
+        <w:jc w:val="both"/>
         <w:spacing w:after="240" w:line="240" w:lineRule="auto"/>
       </w:pPr>
       <w:r>
         <w:rPr>
-          <w:i/>
+          <w:b/>
+          <w:bCs/>
           <w:sz w:val="20"/>
           <w:szCs w:val="20"/>
         </w:rPr>
-        <w:t xml:space="preserve">Figura 12. Despliegue completado desde GitHub Actions.</w:t>
+        <w:t xml:space="preserve">Figura 12. Despliegue completado en GitHub Actions. Los dos intentos anteriores fallaron por falta de secretos; este terminó en un minuto.</w:t>
       </w:r>
     </w:p>
     <w:p>
@@ -3422,16 +3433,17 @@
     </w:p>
     <w:p>
       <w:pPr>
-        <w:jc w:val="center"/>
+        <w:jc w:val="both"/>
         <w:spacing w:after="240" w:line="240" w:lineRule="auto"/>
       </w:pPr>
       <w:r>
         <w:rPr>
-          <w:i/>
+          <w:b/>
+          <w:bCs/>
           <w:sz w:val="20"/>
           <w:szCs w:val="20"/>
         </w:rPr>
-        <w:t xml:space="preserve">Figura 13. Dominio activo en el panel del hosting.</w:t>
+        <w:t xml:space="preserve">Figura 13. Dominio activo en el panel del hosting, ya asociado a la cuenta y sirviendo el sitio.</w:t>
       </w:r>
     </w:p>
     <w:p>
@@ -3489,16 +3501,17 @@
     </w:p>
     <w:p>
       <w:pPr>
-        <w:jc w:val="center"/>
+        <w:jc w:val="both"/>
         <w:spacing w:after="240" w:line="240" w:lineRule="auto"/>
       </w:pPr>
       <w:r>
         <w:rPr>
-          <w:i/>
+          <w:b/>
+          <w:bCs/>
           <w:sz w:val="20"/>
           <w:szCs w:val="20"/>
         </w:rPr>
-        <w:t xml:space="preserve">Figura 14. Pantalla de recuperación anterior, que dependía del correo.</w:t>
+        <w:t xml:space="preserve">Figura 14. Versión anterior de la recuperación de contraseña. Dependía del correo, que los alojamientos gratuitos no permiten enviar.</w:t>
       </w:r>
     </w:p>
     <w:p>
@@ -3556,16 +3569,17 @@
     </w:p>
     <w:p>
       <w:pPr>
-        <w:jc w:val="center"/>
+        <w:jc w:val="both"/>
         <w:spacing w:after="240" w:line="240" w:lineRule="auto"/>
       </w:pPr>
       <w:r>
         <w:rPr>
-          <w:i/>
+          <w:b/>
+          <w:bCs/>
           <w:sz w:val="20"/>
           <w:szCs w:val="20"/>
         </w:rPr>
-        <w:t xml:space="preserve">Figura 15. Pantalla de recuperación con código, ya publicada.</w:t>
+        <w:t xml:space="preserve">Figura 15. Versión nueva, con código de recuperación que no necesita correo. Llegó al servidor con un solo push.</w:t>
       </w:r>
     </w:p>
     <w:p>

</xml_diff>